<commit_message>
docs: align proposal schedule with college timeline
</commit_message>
<xml_diff>
--- a/docs/thesis-proposal.docx
+++ b/docs/thesis-proposal.docx
@@ -2352,7 +2352,7 @@
                 <w:b w:val="0"/>
                 <w:sz w:val="21"/>
               </w:rPr>
-              <w:t>实验组合多、计算时间长</w:t>
+              <w:t>实验组合多、计算时间长，初稿截止时间早（2027年1月15日）</w:t>
             </w:r>
           </w:p>
         </w:tc>
@@ -2524,6 +2524,20 @@
         <w:t>八、研究进度安排</w:t>
       </w:r>
     </w:p>
+    <w:p>
+      <w:pPr>
+        <w:spacing w:line="360" w:lineRule="auto" w:after="0"/>
+        <w:ind w:firstLine="480"/>
+      </w:pPr>
+      <w:r>
+        <w:rPr>
+          <w:rFonts w:ascii="Times New Roman" w:hAnsi="Times New Roman" w:eastAsia="宋体"/>
+          <w:b w:val="0"/>
+          <w:sz w:val="24"/>
+        </w:rPr>
+        <w:t>根据《数理学院2027届本科毕业设计（论文）时间安排和具体工作要求》，结合本课题实验量较大的特点，将全部实验安排在论文初稿截止前完成，具体安排如下：</w:t>
+      </w:r>
+    </w:p>
     <w:tbl>
       <w:tblPr>
         <w:tblW w:type="auto" w:w="0"/>
@@ -2539,13 +2553,14 @@
         </w:tblBorders>
       </w:tblPr>
       <w:tblGrid>
-        <w:gridCol w:w="4533"/>
-        <w:gridCol w:w="4533"/>
+        <w:gridCol w:w="3022"/>
+        <w:gridCol w:w="3022"/>
+        <w:gridCol w:w="3022"/>
       </w:tblGrid>
       <w:tr>
         <w:tc>
           <w:tcPr>
-            <w:tcW w:type="dxa" w:w="4533"/>
+            <w:tcW w:type="dxa" w:w="3022"/>
           </w:tcPr>
           <w:p>
             <w:pPr>
@@ -2564,7 +2579,7 @@
         </w:tc>
         <w:tc>
           <w:tcPr>
-            <w:tcW w:type="dxa" w:w="4533"/>
+            <w:tcW w:type="dxa" w:w="3022"/>
           </w:tcPr>
           <w:p>
             <w:pPr>
@@ -2581,11 +2596,30 @@
             </w:r>
           </w:p>
         </w:tc>
+        <w:tc>
+          <w:tcPr>
+            <w:tcW w:type="dxa" w:w="3022"/>
+          </w:tcPr>
+          <w:p>
+            <w:pPr>
+              <w:jc w:val="center"/>
+            </w:pPr>
+            <w:r/>
+            <w:r>
+              <w:rPr>
+                <w:rFonts w:ascii="Times New Roman" w:hAnsi="Times New Roman" w:eastAsia="黑体"/>
+                <w:b w:val="0"/>
+                <w:sz w:val="21"/>
+              </w:rPr>
+              <w:t>学院节点</w:t>
+            </w:r>
+          </w:p>
+        </w:tc>
       </w:tr>
       <w:tr>
         <w:tc>
           <w:tcPr>
-            <w:tcW w:type="dxa" w:w="4533"/>
+            <w:tcW w:type="dxa" w:w="3022"/>
           </w:tcPr>
           <w:p>
             <w:r/>
@@ -2595,13 +2629,13 @@
                 <w:b w:val="0"/>
                 <w:sz w:val="21"/>
               </w:rPr>
-              <w:t>2026年10月</w:t>
+              <w:t>2026年10月9日前</w:t>
             </w:r>
           </w:p>
         </w:tc>
         <w:tc>
           <w:tcPr>
-            <w:tcW w:type="dxa" w:w="4533"/>
+            <w:tcW w:type="dxa" w:w="3022"/>
           </w:tcPr>
           <w:p>
             <w:r/>
@@ -2611,15 +2645,13 @@
                 <w:b w:val="0"/>
                 <w:sz w:val="21"/>
               </w:rPr>
-              <w:t>查阅文献，确定选题，完成开题报告</w:t>
+              <w:t>确定选题</w:t>
             </w:r>
           </w:p>
         </w:tc>
-      </w:tr>
-      <w:tr>
         <w:tc>
           <w:tcPr>
-            <w:tcW w:type="dxa" w:w="4533"/>
+            <w:tcW w:type="dxa" w:w="3022"/>
           </w:tcPr>
           <w:p>
             <w:r/>
@@ -2629,13 +2661,15 @@
                 <w:b w:val="0"/>
                 <w:sz w:val="21"/>
               </w:rPr>
-              <w:t>2026年11月</w:t>
+              <w:t>完成选题（10月9日）</w:t>
             </w:r>
           </w:p>
         </w:tc>
+      </w:tr>
+      <w:tr>
         <w:tc>
           <w:tcPr>
-            <w:tcW w:type="dxa" w:w="4533"/>
+            <w:tcW w:type="dxa" w:w="3022"/>
           </w:tcPr>
           <w:p>
             <w:r/>
@@ -2645,15 +2679,13 @@
                 <w:b w:val="0"/>
                 <w:sz w:val="21"/>
               </w:rPr>
-              <w:t>配置实验环境，获取数据，完成描述性统计与预处理；学习 LoRA 与统计检验方法</w:t>
+              <w:t>2026年10月10日—10月16日</w:t>
             </w:r>
           </w:p>
         </w:tc>
-      </w:tr>
-      <w:tr>
         <w:tc>
           <w:tcPr>
-            <w:tcW w:type="dxa" w:w="4533"/>
+            <w:tcW w:type="dxa" w:w="3022"/>
           </w:tcPr>
           <w:p>
             <w:r/>
@@ -2663,13 +2695,13 @@
                 <w:b w:val="0"/>
                 <w:sz w:val="21"/>
               </w:rPr>
-              <w:t>2026年12月</w:t>
+              <w:t>接收任务书，查阅文献</w:t>
             </w:r>
           </w:p>
         </w:tc>
         <w:tc>
           <w:tcPr>
-            <w:tcW w:type="dxa" w:w="4533"/>
+            <w:tcW w:type="dxa" w:w="3022"/>
           </w:tcPr>
           <w:p>
             <w:r/>
@@ -2679,7 +2711,7 @@
                 <w:b w:val="0"/>
                 <w:sz w:val="21"/>
               </w:rPr>
-              <w:t>完成传统机器学习与 BERT 基准实验；完成大模型提示实验</w:t>
+              <w:t>任务书下达（10月16日）</w:t>
             </w:r>
           </w:p>
         </w:tc>
@@ -2687,7 +2719,7 @@
       <w:tr>
         <w:tc>
           <w:tcPr>
-            <w:tcW w:type="dxa" w:w="4533"/>
+            <w:tcW w:type="dxa" w:w="3022"/>
           </w:tcPr>
           <w:p>
             <w:r/>
@@ -2697,13 +2729,13 @@
                 <w:b w:val="0"/>
                 <w:sz w:val="21"/>
               </w:rPr>
-              <w:t>2027年1月</w:t>
+              <w:t>2026年10月17日—11月7日</w:t>
             </w:r>
           </w:p>
         </w:tc>
         <w:tc>
           <w:tcPr>
-            <w:tcW w:type="dxa" w:w="4533"/>
+            <w:tcW w:type="dxa" w:w="3022"/>
           </w:tcPr>
           <w:p>
             <w:r/>
@@ -2713,15 +2745,13 @@
                 <w:b w:val="0"/>
                 <w:sz w:val="21"/>
               </w:rPr>
-              <w:t>完成 Qwen3 QLoRA 微调与实验一</w:t>
+              <w:t>撰写开题报告；配置实验环境，获取 FinFE 数据，完成描述性统计与预处理</w:t>
             </w:r>
           </w:p>
         </w:tc>
-      </w:tr>
-      <w:tr>
         <w:tc>
           <w:tcPr>
-            <w:tcW w:type="dxa" w:w="4533"/>
+            <w:tcW w:type="dxa" w:w="3022"/>
           </w:tcPr>
           <w:p>
             <w:r/>
@@ -2731,13 +2761,15 @@
                 <w:b w:val="0"/>
                 <w:sz w:val="21"/>
               </w:rPr>
-              <w:t>2027年2月</w:t>
+              <w:t>提交开题报告（11月7日）</w:t>
             </w:r>
           </w:p>
         </w:tc>
+      </w:tr>
+      <w:tr>
         <w:tc>
           <w:tcPr>
-            <w:tcW w:type="dxa" w:w="4533"/>
+            <w:tcW w:type="dxa" w:w="3022"/>
           </w:tcPr>
           <w:p>
             <w:r/>
@@ -2747,15 +2779,13 @@
                 <w:b w:val="0"/>
                 <w:sz w:val="21"/>
               </w:rPr>
-              <w:t>完成实验二（样本量实验）与实验三（模型规模实验）</w:t>
+              <w:t>2026年11月8日—11月30日</w:t>
             </w:r>
           </w:p>
         </w:tc>
-      </w:tr>
-      <w:tr>
         <w:tc>
           <w:tcPr>
-            <w:tcW w:type="dxa" w:w="4533"/>
+            <w:tcW w:type="dxa" w:w="3022"/>
           </w:tcPr>
           <w:p>
             <w:r/>
@@ -2765,13 +2795,13 @@
                 <w:b w:val="0"/>
                 <w:sz w:val="21"/>
               </w:rPr>
-              <w:t>2027年3月</w:t>
+              <w:t>完成传统机器学习、BERT 基准实验和大模型提示实验；完成 Qwen3 QLoRA 微调与实验一</w:t>
             </w:r>
           </w:p>
         </w:tc>
         <w:tc>
           <w:tcPr>
-            <w:tcW w:type="dxa" w:w="4533"/>
+            <w:tcW w:type="dxa" w:w="3022"/>
           </w:tcPr>
           <w:p>
             <w:r/>
@@ -2781,7 +2811,7 @@
                 <w:b w:val="0"/>
                 <w:sz w:val="21"/>
               </w:rPr>
-              <w:t>完成实验四（校准与误差分析）；整理实验结果；提交中期检查</w:t>
+              <w:t>开题报告审核（11月19日）</w:t>
             </w:r>
           </w:p>
         </w:tc>
@@ -2789,7 +2819,7 @@
       <w:tr>
         <w:tc>
           <w:tcPr>
-            <w:tcW w:type="dxa" w:w="4533"/>
+            <w:tcW w:type="dxa" w:w="3022"/>
           </w:tcPr>
           <w:p>
             <w:r/>
@@ -2799,13 +2829,13 @@
                 <w:b w:val="0"/>
                 <w:sz w:val="21"/>
               </w:rPr>
-              <w:t>2027年4月</w:t>
+              <w:t>2026年12月1日—12月19日</w:t>
             </w:r>
           </w:p>
         </w:tc>
         <w:tc>
           <w:tcPr>
-            <w:tcW w:type="dxa" w:w="4533"/>
+            <w:tcW w:type="dxa" w:w="3022"/>
           </w:tcPr>
           <w:p>
             <w:r/>
@@ -2815,15 +2845,13 @@
                 <w:b w:val="0"/>
                 <w:sz w:val="21"/>
               </w:rPr>
-              <w:t>撰写论文初稿，与指导教师讨论修改</w:t>
+              <w:t>完成实验二（样本量实验）；撰写文献综述，完成外文翻译</w:t>
             </w:r>
           </w:p>
         </w:tc>
-      </w:tr>
-      <w:tr>
         <w:tc>
           <w:tcPr>
-            <w:tcW w:type="dxa" w:w="4533"/>
+            <w:tcW w:type="dxa" w:w="3022"/>
           </w:tcPr>
           <w:p>
             <w:r/>
@@ -2833,13 +2861,15 @@
                 <w:b w:val="0"/>
                 <w:sz w:val="21"/>
               </w:rPr>
-              <w:t>2027年5月</w:t>
+              <w:t>提交文献综述、外文翻译（12月19日）</w:t>
             </w:r>
           </w:p>
         </w:tc>
+      </w:tr>
+      <w:tr>
         <w:tc>
           <w:tcPr>
-            <w:tcW w:type="dxa" w:w="4533"/>
+            <w:tcW w:type="dxa" w:w="3022"/>
           </w:tcPr>
           <w:p>
             <w:r/>
@@ -2849,7 +2879,239 @@
                 <w:b w:val="0"/>
                 <w:sz w:val="21"/>
               </w:rPr>
-              <w:t>修改定稿，查重，准备答辩</w:t>
+              <w:t>2026年12月20日—12月31日</w:t>
+            </w:r>
+          </w:p>
+        </w:tc>
+        <w:tc>
+          <w:tcPr>
+            <w:tcW w:type="dxa" w:w="3022"/>
+          </w:tcPr>
+          <w:p>
+            <w:r/>
+            <w:r>
+              <w:rPr>
+                <w:rFonts w:ascii="Times New Roman" w:hAnsi="Times New Roman" w:eastAsia="宋体"/>
+                <w:b w:val="0"/>
+                <w:sz w:val="21"/>
+              </w:rPr>
+              <w:t>完成实验三（模型规模实验）与实验四（校准与误差分析）；整理实验结果</w:t>
+            </w:r>
+          </w:p>
+        </w:tc>
+        <w:tc>
+          <w:tcPr>
+            <w:tcW w:type="dxa" w:w="3022"/>
+          </w:tcPr>
+          <w:p>
+            <w:r/>
+            <w:r>
+              <w:rPr>
+                <w:rFonts w:ascii="Times New Roman" w:hAnsi="Times New Roman" w:eastAsia="宋体"/>
+                <w:b w:val="0"/>
+                <w:sz w:val="21"/>
+              </w:rPr>
+              <w:t>文献综述、外文翻译审核</w:t>
+            </w:r>
+          </w:p>
+        </w:tc>
+      </w:tr>
+      <w:tr>
+        <w:tc>
+          <w:tcPr>
+            <w:tcW w:type="dxa" w:w="3022"/>
+          </w:tcPr>
+          <w:p>
+            <w:r/>
+            <w:r>
+              <w:rPr>
+                <w:rFonts w:ascii="Times New Roman" w:hAnsi="Times New Roman" w:eastAsia="宋体"/>
+                <w:b w:val="0"/>
+                <w:sz w:val="21"/>
+              </w:rPr>
+              <w:t>2027年1月1日—1月15日</w:t>
+            </w:r>
+          </w:p>
+        </w:tc>
+        <w:tc>
+          <w:tcPr>
+            <w:tcW w:type="dxa" w:w="3022"/>
+          </w:tcPr>
+          <w:p>
+            <w:r/>
+            <w:r>
+              <w:rPr>
+                <w:rFonts w:ascii="Times New Roman" w:hAnsi="Times New Roman" w:eastAsia="宋体"/>
+                <w:b w:val="0"/>
+                <w:sz w:val="21"/>
+              </w:rPr>
+              <w:t>撰写并提交论文初稿</w:t>
+            </w:r>
+          </w:p>
+        </w:tc>
+        <w:tc>
+          <w:tcPr>
+            <w:tcW w:type="dxa" w:w="3022"/>
+          </w:tcPr>
+          <w:p>
+            <w:r/>
+            <w:r>
+              <w:rPr>
+                <w:rFonts w:ascii="Times New Roman" w:hAnsi="Times New Roman" w:eastAsia="宋体"/>
+                <w:b w:val="0"/>
+                <w:sz w:val="21"/>
+              </w:rPr>
+              <w:t>提交论文初稿（1月15日）</w:t>
+            </w:r>
+          </w:p>
+        </w:tc>
+      </w:tr>
+      <w:tr>
+        <w:tc>
+          <w:tcPr>
+            <w:tcW w:type="dxa" w:w="3022"/>
+          </w:tcPr>
+          <w:p>
+            <w:r/>
+            <w:r>
+              <w:rPr>
+                <w:rFonts w:ascii="Times New Roman" w:hAnsi="Times New Roman" w:eastAsia="宋体"/>
+                <w:b w:val="0"/>
+                <w:sz w:val="21"/>
+              </w:rPr>
+              <w:t>2027年1月16日—3月6日</w:t>
+            </w:r>
+          </w:p>
+        </w:tc>
+        <w:tc>
+          <w:tcPr>
+            <w:tcW w:type="dxa" w:w="3022"/>
+          </w:tcPr>
+          <w:p>
+            <w:r/>
+            <w:r>
+              <w:rPr>
+                <w:rFonts w:ascii="Times New Roman" w:hAnsi="Times New Roman" w:eastAsia="宋体"/>
+                <w:b w:val="0"/>
+                <w:sz w:val="21"/>
+              </w:rPr>
+              <w:t>根据指导教师意见修改论文，补充实验，准备中期检查</w:t>
+            </w:r>
+          </w:p>
+        </w:tc>
+        <w:tc>
+          <w:tcPr>
+            <w:tcW w:type="dxa" w:w="3022"/>
+          </w:tcPr>
+          <w:p>
+            <w:r/>
+            <w:r>
+              <w:rPr>
+                <w:rFonts w:ascii="Times New Roman" w:hAnsi="Times New Roman" w:eastAsia="宋体"/>
+                <w:b w:val="0"/>
+                <w:sz w:val="21"/>
+              </w:rPr>
+              <w:t>中期检查（开学前；3月6日）</w:t>
+            </w:r>
+          </w:p>
+        </w:tc>
+      </w:tr>
+      <w:tr>
+        <w:tc>
+          <w:tcPr>
+            <w:tcW w:type="dxa" w:w="3022"/>
+          </w:tcPr>
+          <w:p>
+            <w:r/>
+            <w:r>
+              <w:rPr>
+                <w:rFonts w:ascii="Times New Roman" w:hAnsi="Times New Roman" w:eastAsia="宋体"/>
+                <w:b w:val="0"/>
+                <w:sz w:val="21"/>
+              </w:rPr>
+              <w:t>2027年3月7日—4月9日</w:t>
+            </w:r>
+          </w:p>
+        </w:tc>
+        <w:tc>
+          <w:tcPr>
+            <w:tcW w:type="dxa" w:w="3022"/>
+          </w:tcPr>
+          <w:p>
+            <w:r/>
+            <w:r>
+              <w:rPr>
+                <w:rFonts w:ascii="Times New Roman" w:hAnsi="Times New Roman" w:eastAsia="宋体"/>
+                <w:b w:val="0"/>
+                <w:sz w:val="21"/>
+              </w:rPr>
+              <w:t>完善论文，查重，提交终稿</w:t>
+            </w:r>
+          </w:p>
+        </w:tc>
+        <w:tc>
+          <w:tcPr>
+            <w:tcW w:type="dxa" w:w="3022"/>
+          </w:tcPr>
+          <w:p>
+            <w:r/>
+            <w:r>
+              <w:rPr>
+                <w:rFonts w:ascii="Times New Roman" w:hAnsi="Times New Roman" w:eastAsia="宋体"/>
+                <w:b w:val="0"/>
+                <w:sz w:val="21"/>
+              </w:rPr>
+              <w:t>提交论文终稿（4月9日）</w:t>
+            </w:r>
+          </w:p>
+        </w:tc>
+      </w:tr>
+      <w:tr>
+        <w:tc>
+          <w:tcPr>
+            <w:tcW w:type="dxa" w:w="3022"/>
+          </w:tcPr>
+          <w:p>
+            <w:r/>
+            <w:r>
+              <w:rPr>
+                <w:rFonts w:ascii="Times New Roman" w:hAnsi="Times New Roman" w:eastAsia="宋体"/>
+                <w:b w:val="0"/>
+                <w:sz w:val="21"/>
+              </w:rPr>
+              <w:t>2027年4月10日—5月6日</w:t>
+            </w:r>
+          </w:p>
+        </w:tc>
+        <w:tc>
+          <w:tcPr>
+            <w:tcW w:type="dxa" w:w="3022"/>
+          </w:tcPr>
+          <w:p>
+            <w:r/>
+            <w:r>
+              <w:rPr>
+                <w:rFonts w:ascii="Times New Roman" w:hAnsi="Times New Roman" w:eastAsia="宋体"/>
+                <w:b w:val="0"/>
+                <w:sz w:val="21"/>
+              </w:rPr>
+              <w:t>根据评阅意见修改，准备答辩</w:t>
+            </w:r>
+          </w:p>
+        </w:tc>
+        <w:tc>
+          <w:tcPr>
+            <w:tcW w:type="dxa" w:w="3022"/>
+          </w:tcPr>
+          <w:p>
+            <w:r/>
+            <w:r>
+              <w:rPr>
+                <w:rFonts w:ascii="Times New Roman" w:hAnsi="Times New Roman" w:eastAsia="宋体"/>
+                <w:b w:val="0"/>
+                <w:sz w:val="21"/>
+              </w:rPr>
+              <w:t>评阅（4月23日）、交叉评阅（4月30日）、答辩（5月6日）</w:t>
             </w:r>
           </w:p>
         </w:tc>
@@ -2867,7 +3129,7 @@
           <w:b w:val="0"/>
           <w:sz w:val="24"/>
         </w:rPr>
-        <w:t>注：具体时间节点以学院通知为准。</w:t>
+        <w:t>注：具体时间节点以学院最新通知为准。</w:t>
       </w:r>
     </w:p>
     <w:p>
@@ -3187,7 +3449,7 @@
           <w:b w:val="0"/>
           <w:sz w:val="21"/>
         </w:rPr>
-        <w:t>[16] Zheng Y, Zhang R, Zhang J, et al. LlamaFactory: Unified efficient fine-tuning of 100+ language models[C]//Proceedings of ACL (System Demonstrations). 2024.</w:t>
+        <w:t>[16] Zheng Y, Zhang R, Zhang J, et al. LlamaFactory: Unified efficient fine-tuning of 100+ language models[C]//Proceedings of the 62nd Annual Meeting of the Association for Computational Linguistics (Volume 3: System Demonstrations). Bangkok: ACL, 2024: 400-410.</w:t>
       </w:r>
     </w:p>
     <w:p>

</xml_diff>

<commit_message>
docs: refine innovation points and add related work
</commit_message>
<xml_diff>
--- a/docs/thesis-proposal.docx
+++ b/docs/thesis-proposal.docx
@@ -394,7 +394,7 @@
           <w:b/>
           <w:sz w:val="24"/>
         </w:rPr>
-        <w:t>中文金融场景研究相对较少</w:t>
+        <w:t>中文金融三分类场景研究不足</w:t>
       </w:r>
       <w:r>
         <w:rPr>
@@ -402,7 +402,7 @@
           <w:b w:val="0"/>
           <w:sz w:val="24"/>
         </w:rPr>
-        <w:t>。已有研究多基于英文数据集（如 Financial PhraseBank），中文金融社交媒体文本口语化强、包含大量股市黑话与反讽，大模型在其中的表现有待系统评估。</w:t>
+        <w:t>。已有研究多基于英文数据集（如 Financial PhraseBank）；少数涉及中文的研究使用的是仅区分积极与消极的二分类数据，任务难度偏低。中文金融社交媒体文本口语化强、包含大量股市黑话与反讽，且“中性”类最难判别，大模型在其中的表现有待系统评估。</w:t>
       </w:r>
     </w:p>
     <w:p>
@@ -454,7 +454,7 @@
           <w:b/>
           <w:sz w:val="24"/>
         </w:rPr>
-        <w:t>缺少对“数据规模”的讨论</w:t>
+        <w:t>对“数据规模”的讨论缺少统计推断</w:t>
       </w:r>
       <w:r>
         <w:rPr>
@@ -462,7 +462,7 @@
           <w:b w:val="0"/>
           <w:sz w:val="24"/>
         </w:rPr>
-        <w:t>。实际应用中标注数据往往昂贵且稀缺，大模型在不同标注数据量下相对于传统方法和 BERT 的优势如何变化，目前缺乏系统的实证分析。</w:t>
+        <w:t>。实际应用中标注数据往往昂贵且稀缺。已有研究虽然观察到大模型在少量数据下即可取得较好效果，但多为单次实验的描述性比较，未对优势是否显著、优势随数据量如何变化进行统计检验。</w:t>
       </w:r>
     </w:p>
     <w:p>
@@ -492,7 +492,7 @@
           <w:b w:val="0"/>
           <w:sz w:val="24"/>
         </w:rPr>
-        <w:t>。在金融决策中，模型不仅要“判断对”，还要“知道自己有多大把握”，而大模型的置信度校准问题研究较少。</w:t>
+        <w:t>。在金融决策中，模型不仅要“判断对”，还要“知道自己有多大把握”。微调后的大模型普遍存在过度自信问题，但在金融情感分析中，置信度校准以及“低置信度样本交由人工处理”的选择性预测机制尚缺乏研究。</w:t>
       </w:r>
     </w:p>
     <w:p>
@@ -648,6 +648,20 @@
     </w:p>
     <w:p>
       <w:pPr>
+        <w:spacing w:line="360" w:lineRule="auto" w:after="0"/>
+        <w:ind w:firstLine="480"/>
+      </w:pPr>
+      <w:r>
+        <w:rPr>
+          <w:rFonts w:ascii="Times New Roman" w:hAnsi="Times New Roman" w:eastAsia="宋体"/>
+          <w:b w:val="0"/>
+          <w:sz w:val="24"/>
+        </w:rPr>
+        <w:t>与本文最为接近的是以下两项研究。Paredes Amorin 等（2025）比较了 FinBERT 与 DeepSeek-LLM 7B、Llama3 8B、Qwen3 8B 三个轻量级大模型在五个金融情感数据集上的表现，并以 5%～100% 的训练数据比例进行微调，发现大模型仅用 5% 的数据即可取得较好效果；但其中文数据集仅包含积极、消极两类，且研究以单次实验的指标比较为主，未进行显著性检验，也未涉及置信度可靠性。Cheng（2025）使用 LoRA 与 QLoRA 微调 Llama-3.1-8B 和 Qwen3-8B，在英文数据集上均优于 FinBERT，且 QLoRA 在显著降低显存的同时保持了相近的准确率。</w:t>
+      </w:r>
+    </w:p>
+    <w:p>
+      <w:pPr>
         <w:spacing w:before="120" w:after="60"/>
       </w:pPr>
       <w:r>
@@ -670,7 +684,7 @@
           <w:b w:val="0"/>
           <w:sz w:val="24"/>
         </w:rPr>
-        <w:t>Dietterich（1998）系统讨论了比较分类算法的统计检验方法，推荐在同一测试集上使用 McNemar 检验（McNemar, 1947）。Efron 和 Tibshirani（1993）提出的 Bootstrap 方法可用于构造评价指标的置信区间；Holm（1979）提出的逐步校正方法可控制多重比较中的第一类错误。Guo 等（2017）发现现代神经网络普遍存在“过度自信”问题，提出用期望校准误差（ECE）度量校准程度，并用温度缩放加以改进。</w:t>
+        <w:t>Dietterich（1998）系统讨论了比较分类算法的统计检验方法，推荐在同一测试集上使用 McNemar 检验（McNemar, 1947）。Efron 和 Tibshirani（1993）提出的 Bootstrap 方法可用于构造评价指标的置信区间；Holm（1979）提出的逐步校正方法可控制多重比较中的第一类错误。Guo 等（2017）发现现代神经网络普遍存在“过度自信”问题，提出用期望校准误差（ECE）度量校准程度，并用温度缩放加以改进；Balabanov 和 Linander（2024）进一步发现经 LoRA 微调的大模型同样存在过度自信现象。在“拒绝判断”方面，Chow（1970）最早提出了分类中错误率与拒识率的权衡理论，Geifman 和 El-Yaniv（2017）将其发展为深度神经网络的选择性分类方法，即模型仅对高置信度样本给出预测，其余交由人工处理。</w:t>
       </w:r>
     </w:p>
     <w:p>
@@ -697,7 +711,7 @@
           <w:b w:val="0"/>
           <w:sz w:val="24"/>
         </w:rPr>
-        <w:t>综上，金融情感分析已从词典法发展到大模型阶段，LoRA/QLoRA 使大模型微调在普通硬件上成为可能。但现有研究以英文数据为主，对中文金融社交媒体文本的系统评估不足；在研究方法上多只比较指标高低，缺少显著性检验、样本量分析和置信度校准分析。本文拟从统计学视角弥补上述不足。</w:t>
+        <w:t>综上，金融情感分析已从词典法发展到大模型阶段，LoRA/QLoRA 使大模型微调在普通硬件上成为可能，“大模型微调优于 BERT”“大模型在少量数据下即有较好表现”已得到初步验证。但现有研究仍存在三点不足：一是以英文或中文二分类数据为主，缺少对含“中性”类的中文金融社交媒体三分类任务的系统评估；二是多为单次实验的指标比较，缺少重复实验、显著性检验和对样本量效应的统计推断；三是几乎未涉及大模型在金融情感分析中的置信度校准与选择性预测。本文拟从统计学视角弥补上述不足。</w:t>
       </w:r>
     </w:p>
     <w:p>
@@ -942,7 +956,7 @@
                 <w:b w:val="0"/>
                 <w:sz w:val="21"/>
               </w:rPr>
-              <w:t>大模型的预测置信度是否校准良好？主要错误类型有哪些？</w:t>
+              <w:t>大模型的预测置信度是否可靠？能否通过拒绝低置信度样本提高预测准确率？主要错误类型有哪些？</w:t>
             </w:r>
           </w:p>
         </w:tc>
@@ -1109,7 +1123,7 @@
           <w:b w:val="0"/>
           <w:sz w:val="24"/>
         </w:rPr>
-        <w:t>：分析各模型的置信度校准情况，尝试温度缩放改进校准；对错误样本进行分类归纳和统计检验。</w:t>
+        <w:t>：分析各模型的置信度校准情况，尝试温度缩放改进校准；开展选择性预测分析，考察拒绝低置信度样本后准确率的提升；对错误样本进行分类归纳和统计检验。</w:t>
       </w:r>
     </w:p>
     <w:p>
@@ -1739,6 +1753,56 @@
                 <w:b w:val="0"/>
                 <w:sz w:val="21"/>
               </w:rPr>
+              <w:t>选择性预测</w:t>
+            </w:r>
+          </w:p>
+        </w:tc>
+        <w:tc>
+          <w:tcPr>
+            <w:tcW w:type="dxa" w:w="3022"/>
+          </w:tcPr>
+          <w:p>
+            <w:r/>
+            <w:r>
+              <w:rPr>
+                <w:rFonts w:ascii="Times New Roman" w:hAnsi="Times New Roman" w:eastAsia="宋体"/>
+                <w:b w:val="0"/>
+                <w:sz w:val="21"/>
+              </w:rPr>
+              <w:t>覆盖率-准确率曲线、AURC（风险-覆盖率曲线下面积）</w:t>
+            </w:r>
+          </w:p>
+        </w:tc>
+        <w:tc>
+          <w:tcPr>
+            <w:tcW w:type="dxa" w:w="3022"/>
+          </w:tcPr>
+          <w:p>
+            <w:r/>
+            <w:r>
+              <w:rPr>
+                <w:rFonts w:ascii="Times New Roman" w:hAnsi="Times New Roman" w:eastAsia="宋体"/>
+                <w:b w:val="0"/>
+                <w:sz w:val="21"/>
+              </w:rPr>
+              <w:t>评估拒绝低置信度样本后的准确率提升</w:t>
+            </w:r>
+          </w:p>
+        </w:tc>
+      </w:tr>
+      <w:tr>
+        <w:tc>
+          <w:tcPr>
+            <w:tcW w:type="dxa" w:w="3022"/>
+          </w:tcPr>
+          <w:p>
+            <w:r/>
+            <w:r>
+              <w:rPr>
+                <w:rFonts w:ascii="Times New Roman" w:hAnsi="Times New Roman" w:eastAsia="宋体"/>
+                <w:b w:val="0"/>
+                <w:sz w:val="21"/>
+              </w:rPr>
               <w:t>误差分析</w:t>
             </w:r>
           </w:p>
@@ -1848,7 +1912,7 @@
           <w:b w:val="0"/>
           <w:sz w:val="24"/>
         </w:rPr>
-        <w:t>：训练样本量取 100、250、500、1000、2000、4000、8000，每个规模重复抽样 3 次，绘制学习曲线并进行双因素方差分析。</w:t>
+        <w:t>：训练样本量取 100、250、500、1000、2000、4000、8000，每个规模重复抽样 3 次，绘制学习曲线并进行双因素方差分析；在每个样本量上对大模型与 BERT 的差异进行显著性检验，并用 Bootstrap 方法估计“优势不再显著”的临界样本量及其置信区间。</w:t>
       </w:r>
     </w:p>
     <w:p>
@@ -1908,7 +1972,7 @@
           <w:b w:val="0"/>
           <w:sz w:val="24"/>
         </w:rPr>
-        <w:t>：计算各模型的 ECE 与 Brier 分数，绘制可靠性图，比较温度缩放前后的校准效果；对错误样本按反讽、否定、专业术语、中性模糊等类型归纳，并进行卡方检验。</w:t>
+        <w:t>：计算各模型的 ECE 与 Brier 分数，绘制可靠性图，比较温度缩放前后的校准效果；按置信度从高到低逐步提高拒识比例，绘制覆盖率-准确率曲线，比较各模型的 AURC，回答“只处理模型最有把握的 80% 样本时准确率能提高多少”等实际问题；对错误样本按反讽、否定、专业术语、中性模糊等类型归纳，并进行卡方检验。</w:t>
       </w:r>
     </w:p>
     <w:p>
@@ -2104,7 +2168,23 @@
           <w:b w:val="0"/>
           <w:sz w:val="24"/>
         </w:rPr>
-        <w:t>1. 以最新开源大模型 Qwen3 为对象，系统评估参数高效微调在中文金融社交媒体情感分类中的表现，补充中文金融场景的实证证据。</w:t>
+        <w:t xml:space="preserve">1. </w:t>
+      </w:r>
+      <w:r>
+        <w:rPr>
+          <w:rFonts w:ascii="Times New Roman" w:hAnsi="Times New Roman" w:eastAsia="宋体"/>
+          <w:b/>
+          <w:sz w:val="24"/>
+        </w:rPr>
+        <w:t>研究场景</w:t>
+      </w:r>
+      <w:r>
+        <w:rPr>
+          <w:rFonts w:ascii="Times New Roman" w:hAnsi="Times New Roman" w:eastAsia="宋体"/>
+          <w:b w:val="0"/>
+          <w:sz w:val="24"/>
+        </w:rPr>
+        <w:t>：针对含“中性”类、文本口语化的中文金融社交媒体三分类任务，系统评估 Qwen3 系列大模型的参数高效微调效果，补充已有研究多基于英文或中文二分类数据的不足。</w:t>
       </w:r>
     </w:p>
     <w:p>
@@ -2118,7 +2198,23 @@
           <w:b w:val="0"/>
           <w:sz w:val="24"/>
         </w:rPr>
-        <w:t>2. 引入 McNemar 检验、Bootstrap 置信区间、方差分析等统计方法，并通过样本量实验刻画大模型在不同数据规模下的优势边界，给出可操作的模型选择建议。</w:t>
+        <w:t xml:space="preserve">2. </w:t>
+      </w:r>
+      <w:r>
+        <w:rPr>
+          <w:rFonts w:ascii="Times New Roman" w:hAnsi="Times New Roman" w:eastAsia="宋体"/>
+          <w:b/>
+          <w:sz w:val="24"/>
+        </w:rPr>
+        <w:t>统计推断</w:t>
+      </w:r>
+      <w:r>
+        <w:rPr>
+          <w:rFonts w:ascii="Times New Roman" w:hAnsi="Times New Roman" w:eastAsia="宋体"/>
+          <w:b w:val="0"/>
+          <w:sz w:val="24"/>
+        </w:rPr>
+        <w:t>：通过多次重复实验、McNemar 检验、Holm 校正和“模型 × 样本量”交互效应的方差分析，对大模型的优势及其随数据规模的变化进行严格的统计检验，并给出临界样本量的区间估计，改进已有研究仅做单次描述性比较的做法。</w:t>
       </w:r>
     </w:p>
     <w:p>
@@ -2132,7 +2228,23 @@
           <w:b w:val="0"/>
           <w:sz w:val="24"/>
         </w:rPr>
-        <w:t>3. 从置信度校准角度评估大模型预测的可靠性，拓展金融情感分析的评价维度。</w:t>
+        <w:t xml:space="preserve">3. </w:t>
+      </w:r>
+      <w:r>
+        <w:rPr>
+          <w:rFonts w:ascii="Times New Roman" w:hAnsi="Times New Roman" w:eastAsia="宋体"/>
+          <w:b/>
+          <w:sz w:val="24"/>
+        </w:rPr>
+        <w:t>可靠性评价</w:t>
+      </w:r>
+      <w:r>
+        <w:rPr>
+          <w:rFonts w:ascii="Times New Roman" w:hAnsi="Times New Roman" w:eastAsia="宋体"/>
+          <w:b w:val="0"/>
+          <w:sz w:val="24"/>
+        </w:rPr>
+        <w:t>：将置信度校准与选择性预测引入金融情感分析，考察大模型“是否知道自己何时会出错”，以及拒绝低置信度样本对准确率的提升，为人机协同的金融文本处理提供依据。</w:t>
       </w:r>
     </w:p>
     <w:p>
@@ -3170,7 +3282,7 @@
           <w:b w:val="0"/>
           <w:sz w:val="24"/>
         </w:rPr>
-        <w:t>2. 第2章 相关理论与方法：TF-IDF、逻辑回归与支持向量机、Transformer 与 BERT、大语言模型与提示学习、LoRA/QLoRA 原理、统计检验方法、校准理论。</w:t>
+        <w:t>2. 第2章 相关理论与方法：TF-IDF、逻辑回归与支持向量机、Transformer 与 BERT、大语言模型与提示学习、LoRA/QLoRA 原理、统计检验方法、校准理论与选择性预测。</w:t>
       </w:r>
     </w:p>
     <w:p>
@@ -3198,7 +3310,7 @@
           <w:b w:val="0"/>
           <w:sz w:val="24"/>
         </w:rPr>
-        <w:t>4. 第4章 实验结果与分析：实验一至实验四的结果与分析。</w:t>
+        <w:t>4. 第4章 实验结果与分析：多模型对比、样本效率、模型规模、置信度校准与选择性预测四个实验的结果与分析。</w:t>
       </w:r>
     </w:p>
     <w:p>
@@ -3536,6 +3648,76 @@
         <w:t>[22] Guo C, Pleiss G, Sun Y, et al. On calibration of modern neural networks[C]//International Conference on Machine Learning. 2017: 1321-1330.</w:t>
       </w:r>
     </w:p>
+    <w:p>
+      <w:pPr>
+        <w:spacing w:line="360" w:lineRule="auto" w:after="0"/>
+        <w:ind w:left="420" w:hanging="420"/>
+      </w:pPr>
+      <w:r>
+        <w:rPr>
+          <w:rFonts w:ascii="Times New Roman" w:hAnsi="Times New Roman" w:eastAsia="宋体"/>
+          <w:b w:val="0"/>
+          <w:sz w:val="21"/>
+        </w:rPr>
+        <w:t>[23] Paredes Amorin A, Python A, Weisser C. Fine-tuning of lightweight large language models for sentiment classification on heterogeneous financial textual data[J]. arXiv preprint arXiv:2512.00946, 2025.</w:t>
+      </w:r>
+    </w:p>
+    <w:p>
+      <w:pPr>
+        <w:spacing w:line="360" w:lineRule="auto" w:after="0"/>
+        <w:ind w:left="420" w:hanging="420"/>
+      </w:pPr>
+      <w:r>
+        <w:rPr>
+          <w:rFonts w:ascii="Times New Roman" w:hAnsi="Times New Roman" w:eastAsia="宋体"/>
+          <w:b w:val="0"/>
+          <w:sz w:val="21"/>
+        </w:rPr>
+        <w:t>[24] Cheng X. Financial sentiment analysis with large language models[J]. Finance &amp; Economics, 2025, 3(6). DOI: 10.61173/gvntfv56.</w:t>
+      </w:r>
+    </w:p>
+    <w:p>
+      <w:pPr>
+        <w:spacing w:line="360" w:lineRule="auto" w:after="0"/>
+        <w:ind w:left="420" w:hanging="420"/>
+      </w:pPr>
+      <w:r>
+        <w:rPr>
+          <w:rFonts w:ascii="Times New Roman" w:hAnsi="Times New Roman" w:eastAsia="宋体"/>
+          <w:b w:val="0"/>
+          <w:sz w:val="21"/>
+        </w:rPr>
+        <w:t>[25] Balabanov O, Linander H. Uncertainty quantification in fine-tuned LLMs using LoRA ensembles[J]. arXiv preprint arXiv:2402.12264, 2024.</w:t>
+      </w:r>
+    </w:p>
+    <w:p>
+      <w:pPr>
+        <w:spacing w:line="360" w:lineRule="auto" w:after="0"/>
+        <w:ind w:left="420" w:hanging="420"/>
+      </w:pPr>
+      <w:r>
+        <w:rPr>
+          <w:rFonts w:ascii="Times New Roman" w:hAnsi="Times New Roman" w:eastAsia="宋体"/>
+          <w:b w:val="0"/>
+          <w:sz w:val="21"/>
+        </w:rPr>
+        <w:t>[26] Chow C K. On optimum recognition error and reject tradeoff[J]. IEEE Transactions on Information Theory, 1970, 16(1): 41-46.</w:t>
+      </w:r>
+    </w:p>
+    <w:p>
+      <w:pPr>
+        <w:spacing w:line="360" w:lineRule="auto" w:after="0"/>
+        <w:ind w:left="420" w:hanging="420"/>
+      </w:pPr>
+      <w:r>
+        <w:rPr>
+          <w:rFonts w:ascii="Times New Roman" w:hAnsi="Times New Roman" w:eastAsia="宋体"/>
+          <w:b w:val="0"/>
+          <w:sz w:val="21"/>
+        </w:rPr>
+        <w:t>[27] Geifman Y, El-Yaniv R. Selective classification for deep neural networks[C]//Advances in Neural Information Processing Systems. 2017.</w:t>
+      </w:r>
+    </w:p>
     <w:sectPr>
       <w:pgSz w:w="12240" w:h="15840"/>
       <w:pgMar w:top="1417" w:right="1587" w:bottom="1417" w:left="1587" w:header="720" w:footer="720" w:gutter="0"/>

</xml_diff>

<commit_message>
docs: correct FinFE split (8802/979/1713) in proposal, review, README; progress update
</commit_message>
<xml_diff>
--- a/docs/thesis-proposal.docx
+++ b/docs/thesis-proposal.docx
@@ -1163,7 +1163,7 @@
           <w:b w:val="0"/>
           <w:sz w:val="24"/>
         </w:rPr>
-        <w:t>采用 BBT-CFLEB 基准中的 FinFE 数据集，其为中文金融社交媒体文本情感三分类数据集，训练集 8000 条、验证集 1000 条、测试集 1000 条，已完成标注和划分，可直接公开获取，无需爬虫采集。</w:t>
+        <w:t>采用 BBT-CFLEB 基准中的 FinFE 数据集，其为中文金融社交媒体文本情感三分类数据集，原论文描述为训练集 8000 条、验证集 1000 条、测试集 1000 条；但公开仓库实际提供带标签样本 18177 条（train_list 16157 条、eval_list 2020 条），且存在大量重复文本。本文去除重复与冲突样本、按文本去重后重新分层划分为训练集 8802 条、验证集 979 条、测试集 1713 条，已完成标注和划分，可直接公开获取，无需爬虫采集。</w:t>
       </w:r>
     </w:p>
     <w:p>
@@ -1912,7 +1912,7 @@
           <w:b w:val="0"/>
           <w:sz w:val="24"/>
         </w:rPr>
-        <w:t>：训练样本量取 100、250、500、1000、2000、4000、8000，每个规模重复抽样 3 次，绘制学习曲线并进行双因素方差分析；在每个样本量上对大模型与 BERT 的差异进行显著性检验，并用 Bootstrap 方法估计“优势不再显著”的临界样本量及其置信区间。</w:t>
+        <w:t>：训练样本量取 100、250、500、1000、2000、4000 及全量（8802），每个规模重复抽样 3 次，绘制学习曲线并进行双因素方差分析；在每个样本量上对大模型与 BERT 的差异进行显著性检验，并用 Bootstrap 方法估计“优势不再显著”的临界样本量及其置信区间。</w:t>
       </w:r>
     </w:p>
     <w:p>

</xml_diff>